<commit_message>
feat : publicité à la fin d'une partie multijoueur
- Interstitiel AdMob affiché quand il ne reste qu'un joueur, avant l'écran du vainqueur
- Pas de pub entre les manches ; préchargement à l'ouverture du mode
- Fiche Play Store mise à jour (emplacements des publicités)

Co-Authored-By: Claude Opus 5.5 <noreply@anthropic.com>
</commit_message>
<xml_diff>
--- a/store/fiche_play_store.docx
+++ b/store/fiche_play_store.docx
@@ -80,7 +80,7 @@
     <w:sdt>
       <w:sdtPr>
         <w:alias w:val="Sommaire"/>
-        <w:id w:val="-411085669"/>
+        <w:id w:val="2017030786"/>
       </w:sdtPr>
       <w:sdtEndPr/>
       <w:sdtContent>
@@ -108,7 +108,7 @@
           <w:r>
             <w:fldChar w:fldCharType="separate"/>
           </w:r>
-          <w:hyperlink w:anchor="_Toc241517788" w:history="1">
+          <w:hyperlink w:anchor="_Toc241519237" w:history="1">
             <w:r>
               <w:rPr>
                 <w:rStyle w:val="Hyperlink"/>
@@ -132,7 +132,7 @@
               <w:rPr>
                 <w:noProof/>
               </w:rPr>
-              <w:instrText xml:space="preserve"> PAGEREF _Toc241517788 \h </w:instrText>
+              <w:instrText xml:space="preserve"> PAGEREF _Toc241519237 \h </w:instrText>
             </w:r>
             <w:r>
               <w:rPr>
@@ -174,7 +174,7 @@
               <w14:ligatures w14:val="standardContextual"/>
             </w:rPr>
           </w:pPr>
-          <w:hyperlink w:anchor="_Toc241517789" w:history="1">
+          <w:hyperlink w:anchor="_Toc241519238" w:history="1">
             <w:r>
               <w:rPr>
                 <w:rStyle w:val="Hyperlink"/>
@@ -198,7 +198,7 @@
               <w:rPr>
                 <w:noProof/>
               </w:rPr>
-              <w:instrText xml:space="preserve"> PAGEREF _Toc241517789 \h </w:instrText>
+              <w:instrText xml:space="preserve"> PAGEREF _Toc241519238 \h </w:instrText>
             </w:r>
             <w:r>
               <w:rPr>
@@ -240,7 +240,7 @@
               <w14:ligatures w14:val="standardContextual"/>
             </w:rPr>
           </w:pPr>
-          <w:hyperlink w:anchor="_Toc241517790" w:history="1">
+          <w:hyperlink w:anchor="_Toc241519239" w:history="1">
             <w:r>
               <w:rPr>
                 <w:rStyle w:val="Hyperlink"/>
@@ -264,7 +264,7 @@
               <w:rPr>
                 <w:noProof/>
               </w:rPr>
-              <w:instrText xml:space="preserve"> PAGEREF _Toc241517790 \h </w:instrText>
+              <w:instrText xml:space="preserve"> PAGEREF _Toc241519239 \h </w:instrText>
             </w:r>
             <w:r>
               <w:rPr>
@@ -306,7 +306,7 @@
               <w14:ligatures w14:val="standardContextual"/>
             </w:rPr>
           </w:pPr>
-          <w:hyperlink w:anchor="_Toc241517791" w:history="1">
+          <w:hyperlink w:anchor="_Toc241519240" w:history="1">
             <w:r>
               <w:rPr>
                 <w:rStyle w:val="Hyperlink"/>
@@ -330,7 +330,7 @@
               <w:rPr>
                 <w:noProof/>
               </w:rPr>
-              <w:instrText xml:space="preserve"> PAGEREF _Toc241517791 \h </w:instrText>
+              <w:instrText xml:space="preserve"> PAGEREF _Toc241519240 \h </w:instrText>
             </w:r>
             <w:r>
               <w:rPr>
@@ -372,7 +372,7 @@
               <w14:ligatures w14:val="standardContextual"/>
             </w:rPr>
           </w:pPr>
-          <w:hyperlink w:anchor="_Toc241517792" w:history="1">
+          <w:hyperlink w:anchor="_Toc241519241" w:history="1">
             <w:r>
               <w:rPr>
                 <w:rStyle w:val="Hyperlink"/>
@@ -396,7 +396,7 @@
               <w:rPr>
                 <w:noProof/>
               </w:rPr>
-              <w:instrText xml:space="preserve"> PAGEREF _Toc241517792 \h </w:instrText>
+              <w:instrText xml:space="preserve"> PAGEREF _Toc241519241 \h </w:instrText>
             </w:r>
             <w:r>
               <w:rPr>
@@ -438,7 +438,7 @@
               <w14:ligatures w14:val="standardContextual"/>
             </w:rPr>
           </w:pPr>
-          <w:hyperlink w:anchor="_Toc241517793" w:history="1">
+          <w:hyperlink w:anchor="_Toc241519242" w:history="1">
             <w:r>
               <w:rPr>
                 <w:rStyle w:val="Hyperlink"/>
@@ -462,7 +462,7 @@
               <w:rPr>
                 <w:noProof/>
               </w:rPr>
-              <w:instrText xml:space="preserve"> PAGEREF _Toc241517793 \h </w:instrText>
+              <w:instrText xml:space="preserve"> PAGEREF _Toc241519242 \h </w:instrText>
             </w:r>
             <w:r>
               <w:rPr>
@@ -504,7 +504,7 @@
               <w14:ligatures w14:val="standardContextual"/>
             </w:rPr>
           </w:pPr>
-          <w:hyperlink w:anchor="_Toc241517794" w:history="1">
+          <w:hyperlink w:anchor="_Toc241519243" w:history="1">
             <w:r>
               <w:rPr>
                 <w:rStyle w:val="Hyperlink"/>
@@ -528,7 +528,7 @@
               <w:rPr>
                 <w:noProof/>
               </w:rPr>
-              <w:instrText xml:space="preserve"> PAGEREF _Toc241517794 \h </w:instrText>
+              <w:instrText xml:space="preserve"> PAGEREF _Toc241519243 \h </w:instrText>
             </w:r>
             <w:r>
               <w:rPr>
@@ -570,7 +570,7 @@
               <w14:ligatures w14:val="standardContextual"/>
             </w:rPr>
           </w:pPr>
-          <w:hyperlink w:anchor="_Toc241517795" w:history="1">
+          <w:hyperlink w:anchor="_Toc241519244" w:history="1">
             <w:r>
               <w:rPr>
                 <w:rStyle w:val="Hyperlink"/>
@@ -594,7 +594,7 @@
               <w:rPr>
                 <w:noProof/>
               </w:rPr>
-              <w:instrText xml:space="preserve"> PAGEREF _Toc241517795 \h </w:instrText>
+              <w:instrText xml:space="preserve"> PAGEREF _Toc241519244 \h </w:instrText>
             </w:r>
             <w:r>
               <w:rPr>
@@ -636,7 +636,7 @@
               <w14:ligatures w14:val="standardContextual"/>
             </w:rPr>
           </w:pPr>
-          <w:hyperlink w:anchor="_Toc241517796" w:history="1">
+          <w:hyperlink w:anchor="_Toc241519245" w:history="1">
             <w:r>
               <w:rPr>
                 <w:rStyle w:val="Hyperlink"/>
@@ -660,7 +660,7 @@
               <w:rPr>
                 <w:noProof/>
               </w:rPr>
-              <w:instrText xml:space="preserve"> PAGEREF _Toc241517796 \h </w:instrText>
+              <w:instrText xml:space="preserve"> PAGEREF _Toc241519245 \h </w:instrText>
             </w:r>
             <w:r>
               <w:rPr>
@@ -702,7 +702,7 @@
               <w14:ligatures w14:val="standardContextual"/>
             </w:rPr>
           </w:pPr>
-          <w:hyperlink w:anchor="_Toc241517797" w:history="1">
+          <w:hyperlink w:anchor="_Toc241519246" w:history="1">
             <w:r>
               <w:rPr>
                 <w:rStyle w:val="Hyperlink"/>
@@ -726,7 +726,7 @@
               <w:rPr>
                 <w:noProof/>
               </w:rPr>
-              <w:instrText xml:space="preserve"> PAGEREF _Toc241517797 \h </w:instrText>
+              <w:instrText xml:space="preserve"> PAGEREF _Toc241519246 \h </w:instrText>
             </w:r>
             <w:r>
               <w:rPr>
@@ -768,7 +768,7 @@
               <w14:ligatures w14:val="standardContextual"/>
             </w:rPr>
           </w:pPr>
-          <w:hyperlink w:anchor="_Toc241517798" w:history="1">
+          <w:hyperlink w:anchor="_Toc241519247" w:history="1">
             <w:r>
               <w:rPr>
                 <w:rStyle w:val="Hyperlink"/>
@@ -792,7 +792,7 @@
               <w:rPr>
                 <w:noProof/>
               </w:rPr>
-              <w:instrText xml:space="preserve"> PAGEREF _Toc241517798 \h </w:instrText>
+              <w:instrText xml:space="preserve"> PAGEREF _Toc241519247 \h </w:instrText>
             </w:r>
             <w:r>
               <w:rPr>
@@ -834,7 +834,7 @@
               <w14:ligatures w14:val="standardContextual"/>
             </w:rPr>
           </w:pPr>
-          <w:hyperlink w:anchor="_Toc241517799" w:history="1">
+          <w:hyperlink w:anchor="_Toc241519248" w:history="1">
             <w:r>
               <w:rPr>
                 <w:rStyle w:val="Hyperlink"/>
@@ -858,7 +858,7 @@
               <w:rPr>
                 <w:noProof/>
               </w:rPr>
-              <w:instrText xml:space="preserve"> PAGEREF _Toc241517799 \h </w:instrText>
+              <w:instrText xml:space="preserve"> PAGEREF _Toc241519248 \h </w:instrText>
             </w:r>
             <w:r>
               <w:rPr>
@@ -900,7 +900,7 @@
               <w14:ligatures w14:val="standardContextual"/>
             </w:rPr>
           </w:pPr>
-          <w:hyperlink w:anchor="_Toc241517800" w:history="1">
+          <w:hyperlink w:anchor="_Toc241519249" w:history="1">
             <w:r>
               <w:rPr>
                 <w:rStyle w:val="Hyperlink"/>
@@ -924,7 +924,7 @@
               <w:rPr>
                 <w:noProof/>
               </w:rPr>
-              <w:instrText xml:space="preserve"> PAGEREF _Toc241517800 \h </w:instrText>
+              <w:instrText xml:space="preserve"> PAGEREF _Toc241519249 \h </w:instrText>
             </w:r>
             <w:r>
               <w:rPr>
@@ -966,7 +966,7 @@
               <w14:ligatures w14:val="standardContextual"/>
             </w:rPr>
           </w:pPr>
-          <w:hyperlink w:anchor="_Toc241517801" w:history="1">
+          <w:hyperlink w:anchor="_Toc241519250" w:history="1">
             <w:r>
               <w:rPr>
                 <w:rStyle w:val="Hyperlink"/>
@@ -990,7 +990,7 @@
               <w:rPr>
                 <w:noProof/>
               </w:rPr>
-              <w:instrText xml:space="preserve"> PAGEREF _Toc241517801 \h </w:instrText>
+              <w:instrText xml:space="preserve"> PAGEREF _Toc241519250 \h </w:instrText>
             </w:r>
             <w:r>
               <w:rPr>
@@ -1032,7 +1032,7 @@
               <w14:ligatures w14:val="standardContextual"/>
             </w:rPr>
           </w:pPr>
-          <w:hyperlink w:anchor="_Toc241517802" w:history="1">
+          <w:hyperlink w:anchor="_Toc241519251" w:history="1">
             <w:r>
               <w:rPr>
                 <w:rStyle w:val="Hyperlink"/>
@@ -1056,7 +1056,7 @@
               <w:rPr>
                 <w:noProof/>
               </w:rPr>
-              <w:instrText xml:space="preserve"> PAGEREF _Toc241517802 \h </w:instrText>
+              <w:instrText xml:space="preserve"> PAGEREF _Toc241519251 \h </w:instrText>
             </w:r>
             <w:r>
               <w:rPr>
@@ -1098,7 +1098,7 @@
               <w14:ligatures w14:val="standardContextual"/>
             </w:rPr>
           </w:pPr>
-          <w:hyperlink w:anchor="_Toc241517803" w:history="1">
+          <w:hyperlink w:anchor="_Toc241519252" w:history="1">
             <w:r>
               <w:rPr>
                 <w:rStyle w:val="Hyperlink"/>
@@ -1122,7 +1122,7 @@
               <w:rPr>
                 <w:noProof/>
               </w:rPr>
-              <w:instrText xml:space="preserve"> PAGEREF _Toc241517803 \h </w:instrText>
+              <w:instrText xml:space="preserve"> PAGEREF _Toc241519252 \h </w:instrText>
             </w:r>
             <w:r>
               <w:rPr>
@@ -1164,7 +1164,7 @@
               <w14:ligatures w14:val="standardContextual"/>
             </w:rPr>
           </w:pPr>
-          <w:hyperlink w:anchor="_Toc241517804" w:history="1">
+          <w:hyperlink w:anchor="_Toc241519253" w:history="1">
             <w:r>
               <w:rPr>
                 <w:rStyle w:val="Hyperlink"/>
@@ -1188,7 +1188,7 @@
               <w:rPr>
                 <w:noProof/>
               </w:rPr>
-              <w:instrText xml:space="preserve"> PAGEREF _Toc241517804 \h </w:instrText>
+              <w:instrText xml:space="preserve"> PAGEREF _Toc241519253 \h </w:instrText>
             </w:r>
             <w:r>
               <w:rPr>
@@ -1230,7 +1230,7 @@
               <w14:ligatures w14:val="standardContextual"/>
             </w:rPr>
           </w:pPr>
-          <w:hyperlink w:anchor="_Toc241517805" w:history="1">
+          <w:hyperlink w:anchor="_Toc241519254" w:history="1">
             <w:r>
               <w:rPr>
                 <w:rStyle w:val="Hyperlink"/>
@@ -1254,7 +1254,7 @@
               <w:rPr>
                 <w:noProof/>
               </w:rPr>
-              <w:instrText xml:space="preserve"> PAGEREF _Toc241517805 \h </w:instrText>
+              <w:instrText xml:space="preserve"> PAGEREF _Toc241519254 \h </w:instrText>
             </w:r>
             <w:r>
               <w:rPr>
@@ -1297,7 +1297,7 @@
       <w:pPr>
         <w:pStyle w:val="Heading1"/>
       </w:pPr>
-      <w:bookmarkStart w:id="0" w:name="_Toc241517788"/>
+      <w:bookmarkStart w:id="0" w:name="_Toc241519237"/>
       <w:r>
         <w:t>1. Carte d'identité de l'application</w:t>
       </w:r>
@@ -2377,7 +2377,7 @@
       <w:pPr>
         <w:pStyle w:val="Heading1"/>
       </w:pPr>
-      <w:bookmarkStart w:id="1" w:name="_Toc241517789"/>
+      <w:bookmarkStart w:id="1" w:name="_Toc241519238"/>
       <w:r>
         <w:t>2. Textes de la fiche</w:t>
       </w:r>
@@ -2387,7 +2387,7 @@
       <w:pPr>
         <w:pStyle w:val="Heading2"/>
       </w:pPr>
-      <w:bookmarkStart w:id="2" w:name="_Toc241517790"/>
+      <w:bookmarkStart w:id="2" w:name="_Toc241519239"/>
       <w:r>
         <w:t>2.1 Titre (30 caractères max.)</w:t>
       </w:r>
@@ -2437,7 +2437,7 @@
       <w:pPr>
         <w:pStyle w:val="Heading2"/>
       </w:pPr>
-      <w:bookmarkStart w:id="3" w:name="_Toc241517791"/>
+      <w:bookmarkStart w:id="3" w:name="_Toc241519240"/>
       <w:r>
         <w:t>2.2 Description courte (80 caractères max.)</w:t>
       </w:r>
@@ -2628,7 +2628,7 @@
       <w:pPr>
         <w:pStyle w:val="Heading2"/>
       </w:pPr>
-      <w:bookmarkStart w:id="4" w:name="_Toc241517792"/>
+      <w:bookmarkStart w:id="4" w:name="_Toc241519241"/>
       <w:r>
         <w:t>2.3 Description complète (4 000 caractères max.)</w:t>
       </w:r>
@@ -4094,7 +4094,7 @@
       <w:pPr>
         <w:pStyle w:val="Heading2"/>
       </w:pPr>
-      <w:bookmarkStart w:id="5" w:name="_Toc241517793"/>
+      <w:bookmarkStart w:id="5" w:name="_Toc241519242"/>
       <w:r>
         <w:t>2.4 Notes de version « Nouveautés » (500 caractères max.)</w:t>
       </w:r>
@@ -4280,7 +4280,7 @@
       <w:pPr>
         <w:pStyle w:val="Heading1"/>
       </w:pPr>
-      <w:bookmarkStart w:id="6" w:name="_Toc241517794"/>
+      <w:bookmarkStart w:id="6" w:name="_Toc241519243"/>
       <w:r>
         <w:t>3. Éléments graphiques</w:t>
       </w:r>
@@ -4897,7 +4897,7 @@
       <w:pPr>
         <w:pStyle w:val="Heading2"/>
       </w:pPr>
-      <w:bookmarkStart w:id="7" w:name="_Toc241517795"/>
+      <w:bookmarkStart w:id="7" w:name="_Toc241519244"/>
       <w:r>
         <w:t>3.1 Ordre conseillé des 8 captures</w:t>
       </w:r>
@@ -5030,7 +5030,7 @@
       <w:pPr>
         <w:pStyle w:val="Heading1"/>
       </w:pPr>
-      <w:bookmarkStart w:id="8" w:name="_Toc241517796"/>
+      <w:bookmarkStart w:id="8" w:name="_Toc241519245"/>
       <w:r>
         <w:t>4. Classification du contenu (questionnaire IARC)</w:t>
       </w:r>
@@ -5747,7 +5747,7 @@
       <w:pPr>
         <w:pStyle w:val="Heading1"/>
       </w:pPr>
-      <w:bookmarkStart w:id="9" w:name="_Toc241517797"/>
+      <w:bookmarkStart w:id="9" w:name="_Toc241519246"/>
       <w:r>
         <w:t>5. Public cible</w:t>
       </w:r>
@@ -5987,7 +5987,7 @@
       <w:pPr>
         <w:pStyle w:val="Heading1"/>
       </w:pPr>
-      <w:bookmarkStart w:id="10" w:name="_Toc241517798"/>
+      <w:bookmarkStart w:id="10" w:name="_Toc241519247"/>
       <w:r>
         <w:t>6. Publicités et identifiant publicitaire</w:t>
       </w:r>
@@ -6295,7 +6295,7 @@
         <w:spacing w:after="60"/>
       </w:pPr>
       <w:r>
-        <w:t>Interstitiel (fin de niveau et fin de Survie) : ca-app-pub-5542646175321041/9569611051</w:t>
+        <w:t>Interstitiel (fin de niveau Solo, fin de partie Survie et fin de partie Multijoueur) : ca-app-pub-5542646175321041/9569611051</w:t>
       </w:r>
     </w:p>
     <w:p>
@@ -6334,7 +6334,7 @@
       <w:pPr>
         <w:pStyle w:val="Heading1"/>
       </w:pPr>
-      <w:bookmarkStart w:id="11" w:name="_Toc241517799"/>
+      <w:bookmarkStart w:id="11" w:name="_Toc241519248"/>
       <w:r>
         <w:t>7. Sécurité des données (Data safety)</w:t>
       </w:r>
@@ -6623,7 +6623,7 @@
       <w:pPr>
         <w:pStyle w:val="Heading2"/>
       </w:pPr>
-      <w:bookmarkStart w:id="12" w:name="_Toc241517800"/>
+      <w:bookmarkStart w:id="12" w:name="_Toc241519249"/>
       <w:r>
         <w:t>7.1 Types de données à déclarer (collectés et partagés, par AdMob)</w:t>
       </w:r>
@@ -6983,7 +6983,7 @@
       <w:pPr>
         <w:pStyle w:val="Heading1"/>
       </w:pPr>
-      <w:bookmarkStart w:id="13" w:name="_Toc241517801"/>
+      <w:bookmarkStart w:id="13" w:name="_Toc241519250"/>
       <w:r>
         <w:t>8. Autres déclarations de la Play Console</w:t>
       </w:r>
@@ -7444,7 +7444,7 @@
       <w:pPr>
         <w:pStyle w:val="Heading1"/>
       </w:pPr>
-      <w:bookmarkStart w:id="14" w:name="_Toc241517802"/>
+      <w:bookmarkStart w:id="14" w:name="_Toc241519251"/>
       <w:r>
         <w:t>9. Règles de confidentialité</w:t>
       </w:r>
@@ -7707,7 +7707,7 @@
       <w:pPr>
         <w:pStyle w:val="Heading1"/>
       </w:pPr>
-      <w:bookmarkStart w:id="15" w:name="_Toc241517803"/>
+      <w:bookmarkStart w:id="15" w:name="_Toc241519252"/>
       <w:r>
         <w:t>10. Étapes de publication (à partir du 1er octobre)</w:t>
       </w:r>
@@ -7840,7 +7840,7 @@
       <w:pPr>
         <w:pStyle w:val="Heading2"/>
       </w:pPr>
-      <w:bookmarkStart w:id="16" w:name="_Toc241517804"/>
+      <w:bookmarkStart w:id="16" w:name="_Toc241519253"/>
       <w:r>
         <w:t>10.1 Déjà fait dans le projet</w:t>
       </w:r>
@@ -7902,7 +7902,7 @@
       <w:pPr>
         <w:pStyle w:val="Heading2"/>
       </w:pPr>
-      <w:bookmarkStart w:id="17" w:name="_Toc241517805"/>
+      <w:bookmarkStart w:id="17" w:name="_Toc241519254"/>
       <w:r>
         <w:t>10.2 Reste à faire</w:t>
       </w:r>
@@ -8071,64 +8071,64 @@
 <file path=word/numbering.xml><?xml version="1.0" encoding="utf-8"?>
 <w:numbering xmlns:wpc="http://schemas.microsoft.com/office/word/2010/wordprocessingCanvas" xmlns:cx="http://schemas.microsoft.com/office/drawing/2014/chartex" xmlns:cx1="http://schemas.microsoft.com/office/drawing/2015/9/8/chartex" xmlns:cx2="http://schemas.microsoft.com/office/drawing/2015/10/21/chartex" xmlns:cx3="http://schemas.microsoft.com/office/drawing/2016/5/9/chartex" xmlns:cx4="http://schemas.microsoft.com/office/drawing/2016/5/10/chartex" xmlns:cx5="http://schemas.microsoft.com/office/drawing/2016/5/11/chartex" xmlns:cx6="http://schemas.microsoft.com/office/drawing/2016/5/12/chartex" xmlns:cx7="http://schemas.microsoft.com/office/drawing/2016/5/13/chartex" xmlns:cx8="http://schemas.microsoft.com/office/drawing/2016/5/14/chartex" xmlns:mc="http://schemas.openxmlformats.org/markup-compatibility/2006" xmlns:aink="http://schemas.microsoft.com/office/drawing/2016/ink" xmlns:am3d="http://schemas.microsoft.com/office/drawing/2017/model3d" xmlns:o="urn:schemas-microsoft-com:office:office" xmlns:oel="http://schemas.microsoft.com/office/2019/extlst" xmlns:r="http://schemas.openxmlformats.org/officeDocument/2006/relationships" xmlns:m="http://schemas.openxmlformats.org/officeDocument/2006/math" xmlns:v="urn:schemas-microsoft-com:vml" xmlns:wp14="http://schemas.microsoft.com/office/word/2010/wordprocessingDrawing" xmlns:wp="http://schemas.openxmlformats.org/drawingml/2006/wordprocessingDrawing" xmlns:w10="urn:schemas-microsoft-com:office:word" xmlns:w="http://schemas.openxmlformats.org/wordprocessingml/2006/main" xmlns:w14="http://schemas.microsoft.com/office/word/2010/wordml" xmlns:w15="http://schemas.microsoft.com/office/word/2012/wordml" xmlns:w16cex="http://schemas.microsoft.com/office/word/2018/wordml/cex" xmlns:w16cid="http://schemas.microsoft.com/office/word/2016/wordml/cid" xmlns:w16="http://schemas.microsoft.com/office/word/2018/wordml" xmlns:w16du="http://schemas.microsoft.com/office/word/2023/wordml/word16du" xmlns:w16sdtdh="http://schemas.microsoft.com/office/word/2020/wordml/sdtdatahash" xmlns:w16sdtfl="http://schemas.microsoft.com/office/word/2024/wordml/sdtformatlock" xmlns:w16se="http://schemas.microsoft.com/office/word/2015/wordml/symex" xmlns:wpg="http://schemas.microsoft.com/office/word/2010/wordprocessingGroup" xmlns:wpi="http://schemas.microsoft.com/office/word/2010/wordprocessingInk" xmlns:wne="http://schemas.microsoft.com/office/word/2006/wordml" xmlns:wps="http://schemas.microsoft.com/office/word/2010/wordprocessingShape" mc:Ignorable="w14 w15 w16se w16cid w16 w16cex w16sdtdh w16sdtfl w16du wp14">
   <w:abstractNum w:abstractNumId="0" w15:restartNumberingAfterBreak="0">
-    <w:nsid w:val="08B073A3"/>
+    <w:nsid w:val="358B5B71"/>
     <w:multiLevelType w:val="hybridMultilevel"/>
-    <w:tmpl w:val="1F56AAD6"/>
-    <w:lvl w:ilvl="0" w:tplc="7BFCF312">
+    <w:tmpl w:val="8C64428E"/>
+    <w:lvl w:ilvl="0" w:tplc="9850BACC">
       <w:start w:val="1"/>
-      <w:numFmt w:val="decimal"/>
-      <w:lvlText w:val="%1."/>
+      <w:numFmt w:val="bullet"/>
+      <w:lvlText w:val="•"/>
       <w:lvlJc w:val="left"/>
       <w:pPr>
         <w:ind w:left="720" w:hanging="360"/>
       </w:pPr>
     </w:lvl>
-    <w:lvl w:ilvl="1" w:tplc="B7944FE6">
+    <w:lvl w:ilvl="1" w:tplc="DBDAD9DE">
       <w:numFmt w:val="decimal"/>
       <w:lvlText w:val=""/>
       <w:lvlJc w:val="left"/>
     </w:lvl>
-    <w:lvl w:ilvl="2" w:tplc="B7142106">
+    <w:lvl w:ilvl="2" w:tplc="BEBA7AF2">
       <w:numFmt w:val="decimal"/>
       <w:lvlText w:val=""/>
       <w:lvlJc w:val="left"/>
     </w:lvl>
-    <w:lvl w:ilvl="3" w:tplc="2BF49306">
+    <w:lvl w:ilvl="3" w:tplc="023624EE">
       <w:numFmt w:val="decimal"/>
       <w:lvlText w:val=""/>
       <w:lvlJc w:val="left"/>
     </w:lvl>
-    <w:lvl w:ilvl="4" w:tplc="EA1A8B52">
+    <w:lvl w:ilvl="4" w:tplc="35DCB3DE">
       <w:numFmt w:val="decimal"/>
       <w:lvlText w:val=""/>
       <w:lvlJc w:val="left"/>
     </w:lvl>
-    <w:lvl w:ilvl="5" w:tplc="47503986">
+    <w:lvl w:ilvl="5" w:tplc="D74C2A18">
       <w:numFmt w:val="decimal"/>
       <w:lvlText w:val=""/>
       <w:lvlJc w:val="left"/>
     </w:lvl>
-    <w:lvl w:ilvl="6" w:tplc="2A0C6508">
+    <w:lvl w:ilvl="6" w:tplc="5E5EB864">
       <w:numFmt w:val="decimal"/>
       <w:lvlText w:val=""/>
       <w:lvlJc w:val="left"/>
     </w:lvl>
-    <w:lvl w:ilvl="7" w:tplc="798C9272">
+    <w:lvl w:ilvl="7" w:tplc="48380490">
       <w:numFmt w:val="decimal"/>
       <w:lvlText w:val=""/>
       <w:lvlJc w:val="left"/>
     </w:lvl>
-    <w:lvl w:ilvl="8" w:tplc="8D30CBD6">
+    <w:lvl w:ilvl="8" w:tplc="897A9F8C">
       <w:numFmt w:val="decimal"/>
       <w:lvlText w:val=""/>
       <w:lvlJc w:val="left"/>
     </w:lvl>
   </w:abstractNum>
   <w:abstractNum w:abstractNumId="1" w15:restartNumberingAfterBreak="0">
-    <w:nsid w:val="2B0A5E34"/>
+    <w:nsid w:val="36FB030B"/>
     <w:multiLevelType w:val="hybridMultilevel"/>
-    <w:tmpl w:val="54CEC224"/>
-    <w:lvl w:ilvl="0" w:tplc="6B7035DE">
+    <w:tmpl w:val="F2B2175C"/>
+    <w:lvl w:ilvl="0" w:tplc="69D80A7C">
       <w:start w:val="1"/>
       <w:numFmt w:val="decimal"/>
       <w:lvlText w:val="%1."/>
@@ -8137,206 +8137,206 @@
         <w:ind w:left="720" w:hanging="360"/>
       </w:pPr>
     </w:lvl>
-    <w:lvl w:ilvl="1" w:tplc="DBC0E2D2">
+    <w:lvl w:ilvl="1" w:tplc="AF90C5C4">
       <w:numFmt w:val="decimal"/>
       <w:lvlText w:val=""/>
       <w:lvlJc w:val="left"/>
     </w:lvl>
-    <w:lvl w:ilvl="2" w:tplc="24FE8FE0">
+    <w:lvl w:ilvl="2" w:tplc="7918FDD0">
       <w:numFmt w:val="decimal"/>
       <w:lvlText w:val=""/>
       <w:lvlJc w:val="left"/>
     </w:lvl>
-    <w:lvl w:ilvl="3" w:tplc="158CF458">
+    <w:lvl w:ilvl="3" w:tplc="A5A2D7AC">
       <w:numFmt w:val="decimal"/>
       <w:lvlText w:val=""/>
       <w:lvlJc w:val="left"/>
     </w:lvl>
-    <w:lvl w:ilvl="4" w:tplc="599E82C2">
+    <w:lvl w:ilvl="4" w:tplc="9D7C1BA8">
       <w:numFmt w:val="decimal"/>
       <w:lvlText w:val=""/>
       <w:lvlJc w:val="left"/>
     </w:lvl>
-    <w:lvl w:ilvl="5" w:tplc="BAD02E26">
+    <w:lvl w:ilvl="5" w:tplc="48D80E68">
       <w:numFmt w:val="decimal"/>
       <w:lvlText w:val=""/>
       <w:lvlJc w:val="left"/>
     </w:lvl>
-    <w:lvl w:ilvl="6" w:tplc="ADDA169A">
+    <w:lvl w:ilvl="6" w:tplc="291C96E2">
       <w:numFmt w:val="decimal"/>
       <w:lvlText w:val=""/>
       <w:lvlJc w:val="left"/>
     </w:lvl>
-    <w:lvl w:ilvl="7" w:tplc="53EE6474">
+    <w:lvl w:ilvl="7" w:tplc="001C8040">
       <w:numFmt w:val="decimal"/>
       <w:lvlText w:val=""/>
       <w:lvlJc w:val="left"/>
     </w:lvl>
-    <w:lvl w:ilvl="8" w:tplc="0BA61AEE">
+    <w:lvl w:ilvl="8" w:tplc="921CD120">
       <w:numFmt w:val="decimal"/>
       <w:lvlText w:val=""/>
       <w:lvlJc w:val="left"/>
     </w:lvl>
   </w:abstractNum>
   <w:abstractNum w:abstractNumId="2" w15:restartNumberingAfterBreak="0">
-    <w:nsid w:val="3DF93D34"/>
+    <w:nsid w:val="37655E2B"/>
     <w:multiLevelType w:val="hybridMultilevel"/>
-    <w:tmpl w:val="6282A388"/>
-    <w:lvl w:ilvl="0" w:tplc="4A144516" w:tentative="1">
+    <w:tmpl w:val="C11CE808"/>
+    <w:lvl w:ilvl="0" w:tplc="FBD0205E">
       <w:start w:val="1"/>
-      <w:numFmt w:val="bullet"/>
-      <w:lvlText w:val="●"/>
+      <w:numFmt w:val="decimal"/>
+      <w:lvlText w:val="%1."/>
       <w:lvlJc w:val="left"/>
       <w:pPr>
         <w:ind w:left="720" w:hanging="360"/>
       </w:pPr>
     </w:lvl>
-    <w:lvl w:ilvl="1" w:tplc="B11E6E62" w:tentative="1">
-      <w:start w:val="1"/>
-      <w:numFmt w:val="bullet"/>
-      <w:lvlText w:val="○"/>
-      <w:lvlJc w:val="left"/>
-      <w:pPr>
-        <w:ind w:left="1440" w:hanging="360"/>
-      </w:pPr>
-    </w:lvl>
-    <w:lvl w:ilvl="2" w:tplc="190E7756" w:tentative="1">
-      <w:start w:val="1"/>
-      <w:numFmt w:val="bullet"/>
-      <w:lvlText w:val="■"/>
-      <w:lvlJc w:val="left"/>
-      <w:pPr>
-        <w:ind w:left="2160" w:hanging="360"/>
-      </w:pPr>
-    </w:lvl>
-    <w:lvl w:ilvl="3" w:tplc="B948A2C6" w:tentative="1">
-      <w:start w:val="1"/>
-      <w:numFmt w:val="bullet"/>
-      <w:lvlText w:val="●"/>
-      <w:lvlJc w:val="left"/>
-      <w:pPr>
-        <w:ind w:left="2880" w:hanging="360"/>
-      </w:pPr>
-    </w:lvl>
-    <w:lvl w:ilvl="4" w:tplc="2890728E" w:tentative="1">
-      <w:start w:val="1"/>
-      <w:numFmt w:val="bullet"/>
-      <w:lvlText w:val="○"/>
-      <w:lvlJc w:val="left"/>
-      <w:pPr>
-        <w:ind w:left="3600" w:hanging="360"/>
-      </w:pPr>
-    </w:lvl>
-    <w:lvl w:ilvl="5" w:tplc="46A6BC8C" w:tentative="1">
-      <w:start w:val="1"/>
-      <w:numFmt w:val="bullet"/>
-      <w:lvlText w:val="■"/>
-      <w:lvlJc w:val="left"/>
-      <w:pPr>
-        <w:ind w:left="4320" w:hanging="360"/>
-      </w:pPr>
-    </w:lvl>
-    <w:lvl w:ilvl="6" w:tplc="F02A3910" w:tentative="1">
-      <w:start w:val="1"/>
-      <w:numFmt w:val="bullet"/>
-      <w:lvlText w:val="●"/>
-      <w:lvlJc w:val="left"/>
-      <w:pPr>
-        <w:ind w:left="5040" w:hanging="360"/>
-      </w:pPr>
-    </w:lvl>
-    <w:lvl w:ilvl="7" w:tplc="703AD9EA" w:tentative="1">
-      <w:start w:val="1"/>
-      <w:numFmt w:val="bullet"/>
-      <w:lvlText w:val="●"/>
-      <w:lvlJc w:val="left"/>
-      <w:pPr>
-        <w:ind w:left="5760" w:hanging="360"/>
-      </w:pPr>
-    </w:lvl>
-    <w:lvl w:ilvl="8" w:tplc="818AFCEC" w:tentative="1">
-      <w:start w:val="1"/>
-      <w:numFmt w:val="bullet"/>
-      <w:lvlText w:val="●"/>
-      <w:lvlJc w:val="left"/>
-      <w:pPr>
-        <w:ind w:left="6480" w:hanging="360"/>
-      </w:pPr>
-    </w:lvl>
-  </w:abstractNum>
-  <w:abstractNum w:abstractNumId="3" w15:restartNumberingAfterBreak="0">
-    <w:nsid w:val="4411148F"/>
-    <w:multiLevelType w:val="hybridMultilevel"/>
-    <w:tmpl w:val="CBCA7896"/>
-    <w:lvl w:ilvl="0" w:tplc="87B47484">
-      <w:start w:val="1"/>
-      <w:numFmt w:val="bullet"/>
-      <w:lvlText w:val="•"/>
-      <w:lvlJc w:val="left"/>
-      <w:pPr>
-        <w:ind w:left="720" w:hanging="360"/>
-      </w:pPr>
-    </w:lvl>
-    <w:lvl w:ilvl="1" w:tplc="62AE0536">
+    <w:lvl w:ilvl="1" w:tplc="2D764C6A">
       <w:numFmt w:val="decimal"/>
       <w:lvlText w:val=""/>
       <w:lvlJc w:val="left"/>
     </w:lvl>
-    <w:lvl w:ilvl="2" w:tplc="351E43E2">
+    <w:lvl w:ilvl="2" w:tplc="FA067934">
       <w:numFmt w:val="decimal"/>
       <w:lvlText w:val=""/>
       <w:lvlJc w:val="left"/>
     </w:lvl>
-    <w:lvl w:ilvl="3" w:tplc="BC4E8D08">
+    <w:lvl w:ilvl="3" w:tplc="575E1902">
       <w:numFmt w:val="decimal"/>
       <w:lvlText w:val=""/>
       <w:lvlJc w:val="left"/>
     </w:lvl>
-    <w:lvl w:ilvl="4" w:tplc="F00E0C60">
+    <w:lvl w:ilvl="4" w:tplc="CC98745A">
       <w:numFmt w:val="decimal"/>
       <w:lvlText w:val=""/>
       <w:lvlJc w:val="left"/>
     </w:lvl>
-    <w:lvl w:ilvl="5" w:tplc="1AD602A2">
+    <w:lvl w:ilvl="5" w:tplc="1F1CFCDE">
       <w:numFmt w:val="decimal"/>
       <w:lvlText w:val=""/>
       <w:lvlJc w:val="left"/>
     </w:lvl>
-    <w:lvl w:ilvl="6" w:tplc="4E20AD80">
+    <w:lvl w:ilvl="6" w:tplc="771CE97A">
       <w:numFmt w:val="decimal"/>
       <w:lvlText w:val=""/>
       <w:lvlJc w:val="left"/>
     </w:lvl>
-    <w:lvl w:ilvl="7" w:tplc="BABC4248">
+    <w:lvl w:ilvl="7" w:tplc="719CE1E8">
       <w:numFmt w:val="decimal"/>
       <w:lvlText w:val=""/>
       <w:lvlJc w:val="left"/>
     </w:lvl>
-    <w:lvl w:ilvl="8" w:tplc="3FCCE2EA">
+    <w:lvl w:ilvl="8" w:tplc="43B042A4">
       <w:numFmt w:val="decimal"/>
       <w:lvlText w:val=""/>
       <w:lvlJc w:val="left"/>
     </w:lvl>
   </w:abstractNum>
-  <w:num w:numId="1" w16cid:durableId="1324242819">
+  <w:abstractNum w:abstractNumId="3" w15:restartNumberingAfterBreak="0">
+    <w:nsid w:val="4307256A"/>
+    <w:multiLevelType w:val="hybridMultilevel"/>
+    <w:tmpl w:val="3B769ADA"/>
+    <w:lvl w:ilvl="0" w:tplc="3E9C3906" w:tentative="1">
+      <w:start w:val="1"/>
+      <w:numFmt w:val="bullet"/>
+      <w:lvlText w:val="●"/>
+      <w:lvlJc w:val="left"/>
+      <w:pPr>
+        <w:ind w:left="720" w:hanging="360"/>
+      </w:pPr>
+    </w:lvl>
+    <w:lvl w:ilvl="1" w:tplc="1A98A062" w:tentative="1">
+      <w:start w:val="1"/>
+      <w:numFmt w:val="bullet"/>
+      <w:lvlText w:val="○"/>
+      <w:lvlJc w:val="left"/>
+      <w:pPr>
+        <w:ind w:left="1440" w:hanging="360"/>
+      </w:pPr>
+    </w:lvl>
+    <w:lvl w:ilvl="2" w:tplc="40B4A21E" w:tentative="1">
+      <w:start w:val="1"/>
+      <w:numFmt w:val="bullet"/>
+      <w:lvlText w:val="■"/>
+      <w:lvlJc w:val="left"/>
+      <w:pPr>
+        <w:ind w:left="2160" w:hanging="360"/>
+      </w:pPr>
+    </w:lvl>
+    <w:lvl w:ilvl="3" w:tplc="02A27ED4" w:tentative="1">
+      <w:start w:val="1"/>
+      <w:numFmt w:val="bullet"/>
+      <w:lvlText w:val="●"/>
+      <w:lvlJc w:val="left"/>
+      <w:pPr>
+        <w:ind w:left="2880" w:hanging="360"/>
+      </w:pPr>
+    </w:lvl>
+    <w:lvl w:ilvl="4" w:tplc="10D8A0FA" w:tentative="1">
+      <w:start w:val="1"/>
+      <w:numFmt w:val="bullet"/>
+      <w:lvlText w:val="○"/>
+      <w:lvlJc w:val="left"/>
+      <w:pPr>
+        <w:ind w:left="3600" w:hanging="360"/>
+      </w:pPr>
+    </w:lvl>
+    <w:lvl w:ilvl="5" w:tplc="07BAD216" w:tentative="1">
+      <w:start w:val="1"/>
+      <w:numFmt w:val="bullet"/>
+      <w:lvlText w:val="■"/>
+      <w:lvlJc w:val="left"/>
+      <w:pPr>
+        <w:ind w:left="4320" w:hanging="360"/>
+      </w:pPr>
+    </w:lvl>
+    <w:lvl w:ilvl="6" w:tplc="308CE882" w:tentative="1">
+      <w:start w:val="1"/>
+      <w:numFmt w:val="bullet"/>
+      <w:lvlText w:val="●"/>
+      <w:lvlJc w:val="left"/>
+      <w:pPr>
+        <w:ind w:left="5040" w:hanging="360"/>
+      </w:pPr>
+    </w:lvl>
+    <w:lvl w:ilvl="7" w:tplc="5B902532" w:tentative="1">
+      <w:start w:val="1"/>
+      <w:numFmt w:val="bullet"/>
+      <w:lvlText w:val="●"/>
+      <w:lvlJc w:val="left"/>
+      <w:pPr>
+        <w:ind w:left="5760" w:hanging="360"/>
+      </w:pPr>
+    </w:lvl>
+    <w:lvl w:ilvl="8" w:tplc="7B084096" w:tentative="1">
+      <w:start w:val="1"/>
+      <w:numFmt w:val="bullet"/>
+      <w:lvlText w:val="●"/>
+      <w:lvlJc w:val="left"/>
+      <w:pPr>
+        <w:ind w:left="6480" w:hanging="360"/>
+      </w:pPr>
+    </w:lvl>
+  </w:abstractNum>
+  <w:num w:numId="1" w16cid:durableId="977223097">
+    <w:abstractNumId w:val="3"/>
+    <w:lvlOverride w:ilvl="0">
+      <w:startOverride w:val="1"/>
+    </w:lvlOverride>
+  </w:num>
+  <w:num w:numId="2" w16cid:durableId="1345673251">
     <w:abstractNumId w:val="2"/>
     <w:lvlOverride w:ilvl="0">
       <w:startOverride w:val="1"/>
     </w:lvlOverride>
   </w:num>
-  <w:num w:numId="2" w16cid:durableId="1372345135">
+  <w:num w:numId="3" w16cid:durableId="1675109197">
     <w:abstractNumId w:val="0"/>
     <w:lvlOverride w:ilvl="0">
       <w:startOverride w:val="1"/>
     </w:lvlOverride>
   </w:num>
-  <w:num w:numId="3" w16cid:durableId="1199124810">
-    <w:abstractNumId w:val="3"/>
-    <w:lvlOverride w:ilvl="0">
-      <w:startOverride w:val="1"/>
-    </w:lvlOverride>
-  </w:num>
-  <w:num w:numId="4" w16cid:durableId="828984849">
+  <w:num w:numId="4" w16cid:durableId="1683438424">
     <w:abstractNumId w:val="1"/>
     <w:lvlOverride w:ilvl="0">
       <w:startOverride w:val="1"/>
@@ -8974,7 +8974,7 @@
     <w:autoRedefine/>
     <w:uiPriority w:val="39"/>
     <w:unhideWhenUsed/>
-    <w:rsid w:val="00771D7E"/>
+    <w:rsid w:val="00290AA5"/>
     <w:pPr>
       <w:spacing w:after="100"/>
     </w:pPr>
@@ -8986,7 +8986,7 @@
     <w:autoRedefine/>
     <w:uiPriority w:val="39"/>
     <w:unhideWhenUsed/>
-    <w:rsid w:val="00771D7E"/>
+    <w:rsid w:val="00290AA5"/>
     <w:pPr>
       <w:spacing w:after="100"/>
       <w:ind w:left="220"/>

</xml_diff>